<commit_message>
Replace the doctor's details in the prescription template with placeholders
Auto_Prescription.docx is the blank template Prototype_App.py fills in,
but its letterhead carried a real doctor's name, qualifications,
specialty, registration number and two phone numbers. They are now
"Dr. A. Example", "MBBS, MD", "(Specialty)", "Reg No. 00000 (State
Council)" and +00 0000000000. The document's author metadata is blanked.

Only the text changed: every run keeps its formatting, both copies of
each text box are updated, and the field labels the app matches on
("Patients Name:", "Age:", ...) are untouched.

Co-Authored-By: Claude Opus 5.5 <noreply@anthropic.com>
Claude-Session: https://claude.ai/code/session_01FjhBWwkCK7okKCjPGHCG2a
</commit_message>
<xml_diff>
--- a/Auto_Prescription_App/Auto_Prescription.docx
+++ b/Auto_Prescription_App/Auto_Prescription.docx
@@ -324,7 +324,7 @@
                                   <w:b/>
                                   <w:color w:val="FFFFFF"/>
                                 </w:rPr>
-                                <w:t>91</w:t>
+                                <w:t>00</w:t>
                               </w:r>
                               <w:r>
                                 <w:rPr>
@@ -342,7 +342,7 @@
                                   <w:color w:val="FFFFFF"/>
                                   <w:spacing w:val="-2"/>
                                 </w:rPr>
-                                <w:t>7479258964,</w:t>
+                                <w:t>0000000000,</w:t>
                               </w:r>
                             </w:p>
                             <w:p>
@@ -359,7 +359,7 @@
                                   <w:b/>
                                   <w:color w:val="FFFFFF"/>
                                 </w:rPr>
-                                <w:t xml:space="preserve">+91 </w:t>
+                                <w:t xml:space="preserve">+00 </w:t>
                               </w:r>
                               <w:r>
                                 <w:rPr>
@@ -368,7 +368,7 @@
                                   <w:color w:val="FFFFFF"/>
                                   <w:spacing w:val="-2"/>
                                 </w:rPr>
-                                <w:t>8170019782</w:t>
+                                <w:t>0000000000</w:t>
                               </w:r>
                             </w:p>
                           </w:txbxContent>
@@ -731,7 +731,7 @@
                             <w:b/>
                             <w:color w:val="FFFFFF"/>
                           </w:rPr>
-                          <w:t>91</w:t>
+                          <w:t>00</w:t>
                         </w:r>
                         <w:r>
                           <w:rPr>
@@ -749,7 +749,7 @@
                             <w:color w:val="FFFFFF"/>
                             <w:spacing w:val="-2"/>
                           </w:rPr>
-                          <w:t>7479258964,</w:t>
+                          <w:t>0000000000,</w:t>
                         </w:r>
                       </w:p>
                       <w:p>
@@ -766,7 +766,7 @@
                             <w:b/>
                             <w:color w:val="FFFFFF"/>
                           </w:rPr>
-                          <w:t xml:space="preserve">+91 </w:t>
+                          <w:t xml:space="preserve">+00 </w:t>
                         </w:r>
                         <w:r>
                           <w:rPr>
@@ -775,7 +775,7 @@
                             <w:color w:val="FFFFFF"/>
                             <w:spacing w:val="-2"/>
                           </w:rPr>
-                          <w:t>8170019782</w:t>
+                          <w:t>0000000000</w:t>
                         </w:r>
                       </w:p>
                     </w:txbxContent>
@@ -1100,7 +1100,7 @@
                 <w:spacing w:val="-2"/>
                 <w:sz w:val="36"/>
               </w:rPr>
-              <w:t>Dr.</w:t>
+              <w:t xml:space="preserve">Dr. A. Example</w:t>
             </w:r>
             <w:r>
               <w:rPr>
@@ -1109,7 +1109,7 @@
                 <w:spacing w:val="-15"/>
                 <w:sz w:val="36"/>
               </w:rPr>
-              <w:t xml:space="preserve"> </w:t>
+              <w:t xml:space="preserve"/>
             </w:r>
             <w:r>
               <w:rPr>
@@ -1118,7 +1118,7 @@
                 <w:spacing w:val="-2"/>
                 <w:sz w:val="36"/>
               </w:rPr>
-              <w:t>Kamalesh</w:t>
+              <w:t xml:space="preserve"/>
             </w:r>
             <w:r>
               <w:rPr>
@@ -1127,7 +1127,7 @@
                 <w:spacing w:val="-12"/>
                 <w:sz w:val="36"/>
               </w:rPr>
-              <w:t xml:space="preserve"> </w:t>
+              <w:t xml:space="preserve"/>
             </w:r>
             <w:r>
               <w:rPr>
@@ -1136,7 +1136,7 @@
                 <w:spacing w:val="-4"/>
                 <w:sz w:val="36"/>
               </w:rPr>
-              <w:t>Bala</w:t>
+              <w:t xml:space="preserve"/>
             </w:r>
           </w:p>
           <w:p>
@@ -1154,7 +1154,7 @@
                 <w:color w:val="FFFFFF"/>
                 <w:sz w:val="32"/>
               </w:rPr>
-              <w:t>MBBS,</w:t>
+              <w:t xml:space="preserve">MBBS, MD</w:t>
             </w:r>
             <w:r>
               <w:rPr>
@@ -1163,7 +1163,7 @@
                 <w:spacing w:val="2"/>
                 <w:sz w:val="32"/>
               </w:rPr>
-              <w:t xml:space="preserve"> </w:t>
+              <w:t xml:space="preserve"/>
             </w:r>
             <w:r>
               <w:rPr>
@@ -1172,7 +1172,7 @@
                 <w:spacing w:val="16"/>
                 <w:sz w:val="32"/>
               </w:rPr>
-              <w:t>DGO, MS</w:t>
+              <w:t xml:space="preserve"/>
             </w:r>
           </w:p>
           <w:p>
@@ -1191,7 +1191,7 @@
                 <w:spacing w:val="18"/>
                 <w:sz w:val="32"/>
               </w:rPr>
-              <w:t>(</w:t>
+              <w:t xml:space="preserve">(Specialty)</w:t>
             </w:r>
             <w:r>
               <w:rPr>
@@ -1200,7 +1200,7 @@
                 <w:spacing w:val="18"/>
                 <w:sz w:val="32"/>
               </w:rPr>
-              <w:t>orthopedics</w:t>
+              <w:t xml:space="preserve"/>
             </w:r>
             <w:r>
               <w:rPr>
@@ -1209,7 +1209,7 @@
                 <w:spacing w:val="18"/>
                 <w:sz w:val="32"/>
               </w:rPr>
-              <w:t>)</w:t>
+              <w:t xml:space="preserve"/>
             </w:r>
           </w:p>
         </w:tc>
@@ -1256,7 +1256,7 @@
                 <w:b/>
                 <w:color w:val="FFFFFF"/>
               </w:rPr>
-              <w:t xml:space="preserve"> </w:t>
+              <w:t xml:space="preserve"> Reg No. 00000 (State Council)</w:t>
             </w:r>
             <w:r>
               <w:rPr>
@@ -1264,7 +1264,7 @@
                 <w:b/>
                 <w:color w:val="FFFFFF"/>
               </w:rPr>
-              <w:t>Reg</w:t>
+              <w:t xml:space="preserve"/>
             </w:r>
             <w:r>
               <w:rPr>
@@ -1273,7 +1273,7 @@
                 <w:color w:val="FFFFFF"/>
                 <w:spacing w:val="-4"/>
               </w:rPr>
-              <w:t xml:space="preserve"> </w:t>
+              <w:t xml:space="preserve"/>
             </w:r>
             <w:r>
               <w:rPr>
@@ -1281,7 +1281,7 @@
                 <w:b/>
                 <w:color w:val="FFFFFF"/>
               </w:rPr>
-              <w:t>No.</w:t>
+              <w:t xml:space="preserve"/>
             </w:r>
             <w:r>
               <w:rPr>
@@ -1290,7 +1290,7 @@
                 <w:color w:val="FFFFFF"/>
                 <w:spacing w:val="-3"/>
               </w:rPr>
-              <w:t xml:space="preserve"> </w:t>
+              <w:t xml:space="preserve"/>
             </w:r>
             <w:r>
               <w:rPr>
@@ -1298,7 +1298,7 @@
                 <w:b/>
                 <w:color w:val="FFFFFF"/>
               </w:rPr>
-              <w:t>50731</w:t>
+              <w:t xml:space="preserve"/>
             </w:r>
             <w:r>
               <w:rPr>
@@ -1307,7 +1307,7 @@
                 <w:color w:val="FFFFFF"/>
                 <w:spacing w:val="-1"/>
               </w:rPr>
-              <w:t xml:space="preserve"> </w:t>
+              <w:t xml:space="preserve"/>
             </w:r>
             <w:r>
               <w:rPr>
@@ -1316,7 +1316,7 @@
                 <w:color w:val="FFFFFF"/>
                 <w:spacing w:val="-2"/>
               </w:rPr>
-              <w:t>(WBMC)</w:t>
+              <w:t xml:space="preserve"/>
             </w:r>
           </w:p>
         </w:tc>

</xml_diff>

<commit_message>
Replace the doctor's details in the prescription template with placeholders (#2)
The template's letterhead carried a real doctor's name, qualifications,
specialty, registration number and phone numbers. They are now
placeholders ("Dr. A. Example", "Reg No. 00000 (State Council)",
+00 0000000000), with the author metadata blanked. Formatting, both
text-box copies and the field labels the app fills are unchanged.

Co-Authored-By: Claude Opus 5.5 <noreply@anthropic.com>
Claude-Session: https://claude.ai/code/session_01FjhBWwkCK7okKCjPGHCG2a
</commit_message>
<xml_diff>
--- a/Auto_Prescription_App/Auto_Prescription.docx
+++ b/Auto_Prescription_App/Auto_Prescription.docx
@@ -324,7 +324,7 @@
                                   <w:b/>
                                   <w:color w:val="FFFFFF"/>
                                 </w:rPr>
-                                <w:t>91</w:t>
+                                <w:t>00</w:t>
                               </w:r>
                               <w:r>
                                 <w:rPr>
@@ -342,7 +342,7 @@
                                   <w:color w:val="FFFFFF"/>
                                   <w:spacing w:val="-2"/>
                                 </w:rPr>
-                                <w:t>7479258964,</w:t>
+                                <w:t>0000000000,</w:t>
                               </w:r>
                             </w:p>
                             <w:p>
@@ -359,7 +359,7 @@
                                   <w:b/>
                                   <w:color w:val="FFFFFF"/>
                                 </w:rPr>
-                                <w:t xml:space="preserve">+91 </w:t>
+                                <w:t xml:space="preserve">+00 </w:t>
                               </w:r>
                               <w:r>
                                 <w:rPr>
@@ -368,7 +368,7 @@
                                   <w:color w:val="FFFFFF"/>
                                   <w:spacing w:val="-2"/>
                                 </w:rPr>
-                                <w:t>8170019782</w:t>
+                                <w:t>0000000000</w:t>
                               </w:r>
                             </w:p>
                           </w:txbxContent>
@@ -731,7 +731,7 @@
                             <w:b/>
                             <w:color w:val="FFFFFF"/>
                           </w:rPr>
-                          <w:t>91</w:t>
+                          <w:t>00</w:t>
                         </w:r>
                         <w:r>
                           <w:rPr>
@@ -749,7 +749,7 @@
                             <w:color w:val="FFFFFF"/>
                             <w:spacing w:val="-2"/>
                           </w:rPr>
-                          <w:t>7479258964,</w:t>
+                          <w:t>0000000000,</w:t>
                         </w:r>
                       </w:p>
                       <w:p>
@@ -766,7 +766,7 @@
                             <w:b/>
                             <w:color w:val="FFFFFF"/>
                           </w:rPr>
-                          <w:t xml:space="preserve">+91 </w:t>
+                          <w:t xml:space="preserve">+00 </w:t>
                         </w:r>
                         <w:r>
                           <w:rPr>
@@ -775,7 +775,7 @@
                             <w:color w:val="FFFFFF"/>
                             <w:spacing w:val="-2"/>
                           </w:rPr>
-                          <w:t>8170019782</w:t>
+                          <w:t>0000000000</w:t>
                         </w:r>
                       </w:p>
                     </w:txbxContent>
@@ -1100,7 +1100,7 @@
                 <w:spacing w:val="-2"/>
                 <w:sz w:val="36"/>
               </w:rPr>
-              <w:t>Dr.</w:t>
+              <w:t xml:space="preserve">Dr. A. Example</w:t>
             </w:r>
             <w:r>
               <w:rPr>
@@ -1109,7 +1109,7 @@
                 <w:spacing w:val="-15"/>
                 <w:sz w:val="36"/>
               </w:rPr>
-              <w:t xml:space="preserve"> </w:t>
+              <w:t xml:space="preserve"/>
             </w:r>
             <w:r>
               <w:rPr>
@@ -1118,7 +1118,7 @@
                 <w:spacing w:val="-2"/>
                 <w:sz w:val="36"/>
               </w:rPr>
-              <w:t>Kamalesh</w:t>
+              <w:t xml:space="preserve"/>
             </w:r>
             <w:r>
               <w:rPr>
@@ -1127,7 +1127,7 @@
                 <w:spacing w:val="-12"/>
                 <w:sz w:val="36"/>
               </w:rPr>
-              <w:t xml:space="preserve"> </w:t>
+              <w:t xml:space="preserve"/>
             </w:r>
             <w:r>
               <w:rPr>
@@ -1136,7 +1136,7 @@
                 <w:spacing w:val="-4"/>
                 <w:sz w:val="36"/>
               </w:rPr>
-              <w:t>Bala</w:t>
+              <w:t xml:space="preserve"/>
             </w:r>
           </w:p>
           <w:p>
@@ -1154,7 +1154,7 @@
                 <w:color w:val="FFFFFF"/>
                 <w:sz w:val="32"/>
               </w:rPr>
-              <w:t>MBBS,</w:t>
+              <w:t xml:space="preserve">MBBS, MD</w:t>
             </w:r>
             <w:r>
               <w:rPr>
@@ -1163,7 +1163,7 @@
                 <w:spacing w:val="2"/>
                 <w:sz w:val="32"/>
               </w:rPr>
-              <w:t xml:space="preserve"> </w:t>
+              <w:t xml:space="preserve"/>
             </w:r>
             <w:r>
               <w:rPr>
@@ -1172,7 +1172,7 @@
                 <w:spacing w:val="16"/>
                 <w:sz w:val="32"/>
               </w:rPr>
-              <w:t>DGO, MS</w:t>
+              <w:t xml:space="preserve"/>
             </w:r>
           </w:p>
           <w:p>
@@ -1191,7 +1191,7 @@
                 <w:spacing w:val="18"/>
                 <w:sz w:val="32"/>
               </w:rPr>
-              <w:t>(</w:t>
+              <w:t xml:space="preserve">(Specialty)</w:t>
             </w:r>
             <w:r>
               <w:rPr>
@@ -1200,7 +1200,7 @@
                 <w:spacing w:val="18"/>
                 <w:sz w:val="32"/>
               </w:rPr>
-              <w:t>orthopedics</w:t>
+              <w:t xml:space="preserve"/>
             </w:r>
             <w:r>
               <w:rPr>
@@ -1209,7 +1209,7 @@
                 <w:spacing w:val="18"/>
                 <w:sz w:val="32"/>
               </w:rPr>
-              <w:t>)</w:t>
+              <w:t xml:space="preserve"/>
             </w:r>
           </w:p>
         </w:tc>
@@ -1256,7 +1256,7 @@
                 <w:b/>
                 <w:color w:val="FFFFFF"/>
               </w:rPr>
-              <w:t xml:space="preserve"> </w:t>
+              <w:t xml:space="preserve"> Reg No. 00000 (State Council)</w:t>
             </w:r>
             <w:r>
               <w:rPr>
@@ -1264,7 +1264,7 @@
                 <w:b/>
                 <w:color w:val="FFFFFF"/>
               </w:rPr>
-              <w:t>Reg</w:t>
+              <w:t xml:space="preserve"/>
             </w:r>
             <w:r>
               <w:rPr>
@@ -1273,7 +1273,7 @@
                 <w:color w:val="FFFFFF"/>
                 <w:spacing w:val="-4"/>
               </w:rPr>
-              <w:t xml:space="preserve"> </w:t>
+              <w:t xml:space="preserve"/>
             </w:r>
             <w:r>
               <w:rPr>
@@ -1281,7 +1281,7 @@
                 <w:b/>
                 <w:color w:val="FFFFFF"/>
               </w:rPr>
-              <w:t>No.</w:t>
+              <w:t xml:space="preserve"/>
             </w:r>
             <w:r>
               <w:rPr>
@@ -1290,7 +1290,7 @@
                 <w:color w:val="FFFFFF"/>
                 <w:spacing w:val="-3"/>
               </w:rPr>
-              <w:t xml:space="preserve"> </w:t>
+              <w:t xml:space="preserve"/>
             </w:r>
             <w:r>
               <w:rPr>
@@ -1298,7 +1298,7 @@
                 <w:b/>
                 <w:color w:val="FFFFFF"/>
               </w:rPr>
-              <w:t>50731</w:t>
+              <w:t xml:space="preserve"/>
             </w:r>
             <w:r>
               <w:rPr>
@@ -1307,7 +1307,7 @@
                 <w:color w:val="FFFFFF"/>
                 <w:spacing w:val="-1"/>
               </w:rPr>
-              <w:t xml:space="preserve"> </w:t>
+              <w:t xml:space="preserve"/>
             </w:r>
             <w:r>
               <w:rPr>
@@ -1316,7 +1316,7 @@
                 <w:color w:val="FFFFFF"/>
                 <w:spacing w:val="-2"/>
               </w:rPr>
-              <w:t>(WBMC)</w:t>
+              <w:t xml:space="preserve"/>
             </w:r>
           </w:p>
         </w:tc>

</xml_diff>